<commit_message>
tree 1 pattern completed
</commit_message>
<xml_diff>
--- a/3.Tree/TreeBasics.docx
+++ b/3.Tree/TreeBasics.docx
@@ -133,362 +133,1015 @@
           <w:lang w:val="en-US"/>
         </w:rPr>
       </w:pPr>
-    </w:p>
-    <w:p>
-      <w:pPr>
-        <w:rPr>
-          <w:b/>
-          <w:bCs/>
-          <w:lang w:val="en-US"/>
-        </w:rPr>
-      </w:pPr>
-    </w:p>
-    <w:p>
-      <w:pPr>
-        <w:rPr>
-          <w:b/>
-          <w:bCs/>
-          <w:lang w:val="en-US"/>
-        </w:rPr>
-      </w:pPr>
-    </w:p>
-    <w:p>
-      <w:pPr>
-        <w:rPr>
-          <w:b/>
-          <w:bCs/>
-          <w:lang w:val="en-US"/>
-        </w:rPr>
-      </w:pPr>
-    </w:p>
-    <w:p>
-      <w:pPr>
-        <w:rPr>
-          <w:b/>
-          <w:bCs/>
-          <w:lang w:val="en-US"/>
-        </w:rPr>
-      </w:pPr>
-    </w:p>
-    <w:p>
-      <w:pPr>
-        <w:rPr>
-          <w:b/>
-          <w:bCs/>
-          <w:lang w:val="en-US"/>
-        </w:rPr>
-      </w:pPr>
-    </w:p>
-    <w:p>
-      <w:pPr>
-        <w:rPr>
-          <w:b/>
-          <w:bCs/>
-          <w:lang w:val="en-US"/>
-        </w:rPr>
-      </w:pPr>
-    </w:p>
-    <w:p>
-      <w:pPr>
-        <w:rPr>
-          <w:b/>
-          <w:bCs/>
-          <w:lang w:val="en-US"/>
-        </w:rPr>
-      </w:pPr>
-    </w:p>
-    <w:p>
-      <w:pPr>
-        <w:rPr>
-          <w:b/>
-          <w:bCs/>
-          <w:lang w:val="en-US"/>
-        </w:rPr>
-      </w:pPr>
-    </w:p>
-    <w:p>
-      <w:pPr>
-        <w:rPr>
-          <w:b/>
-          <w:bCs/>
-          <w:lang w:val="en-US"/>
-        </w:rPr>
-      </w:pPr>
-    </w:p>
-    <w:p>
-      <w:pPr>
-        <w:rPr>
-          <w:b/>
-          <w:bCs/>
-          <w:lang w:val="en-US"/>
-        </w:rPr>
-      </w:pPr>
-    </w:p>
-    <w:p>
-      <w:pPr>
-        <w:rPr>
-          <w:b/>
-          <w:bCs/>
-          <w:lang w:val="en-US"/>
-        </w:rPr>
-      </w:pPr>
-    </w:p>
-    <w:p>
-      <w:pPr>
-        <w:rPr>
-          <w:b/>
-          <w:bCs/>
-          <w:lang w:val="en-US"/>
-        </w:rPr>
-      </w:pPr>
-    </w:p>
-    <w:p>
-      <w:pPr>
-        <w:rPr>
-          <w:b/>
-          <w:bCs/>
-          <w:lang w:val="en-US"/>
-        </w:rPr>
-      </w:pPr>
-    </w:p>
-    <w:p>
-      <w:pPr>
-        <w:rPr>
-          <w:b/>
-          <w:bCs/>
-          <w:lang w:val="en-US"/>
-        </w:rPr>
-      </w:pPr>
-    </w:p>
-    <w:p>
-      <w:pPr>
-        <w:rPr>
-          <w:b/>
-          <w:bCs/>
-          <w:lang w:val="en-US"/>
-        </w:rPr>
-      </w:pPr>
-    </w:p>
-    <w:p>
-      <w:pPr>
-        <w:rPr>
-          <w:b/>
-          <w:bCs/>
-          <w:lang w:val="en-US"/>
-        </w:rPr>
-      </w:pPr>
-    </w:p>
-    <w:p>
-      <w:pPr>
-        <w:rPr>
-          <w:b/>
-          <w:bCs/>
-          <w:lang w:val="en-US"/>
-        </w:rPr>
-      </w:pPr>
-    </w:p>
-    <w:p>
-      <w:pPr>
-        <w:rPr>
-          <w:b/>
-          <w:bCs/>
-          <w:lang w:val="en-US"/>
-        </w:rPr>
-      </w:pPr>
-    </w:p>
-    <w:p>
-      <w:pPr>
-        <w:rPr>
-          <w:b/>
-          <w:bCs/>
-          <w:lang w:val="en-US"/>
-        </w:rPr>
-      </w:pPr>
-    </w:p>
-    <w:p>
-      <w:pPr>
-        <w:rPr>
-          <w:b/>
-          <w:bCs/>
-          <w:lang w:val="en-US"/>
-        </w:rPr>
-      </w:pPr>
-    </w:p>
-    <w:p>
-      <w:pPr>
-        <w:rPr>
-          <w:b/>
-          <w:bCs/>
-          <w:lang w:val="en-US"/>
-        </w:rPr>
-      </w:pPr>
-    </w:p>
-    <w:p>
-      <w:pPr>
-        <w:rPr>
-          <w:b/>
-          <w:bCs/>
-          <w:lang w:val="en-US"/>
-        </w:rPr>
-      </w:pPr>
-    </w:p>
-    <w:p>
-      <w:pPr>
-        <w:rPr>
-          <w:b/>
-          <w:bCs/>
-          <w:lang w:val="en-US"/>
-        </w:rPr>
-      </w:pPr>
-    </w:p>
-    <w:p>
-      <w:pPr>
-        <w:rPr>
-          <w:b/>
-          <w:bCs/>
-          <w:lang w:val="en-US"/>
-        </w:rPr>
-      </w:pPr>
-      <w:r>
-        <w:rPr>
-          <w:b/>
-          <w:bCs/>
-          <w:lang w:val="en-US"/>
-        </w:rPr>
+      <w:r>
+        <w:rPr>
+          <w:b/>
+          <w:bCs/>
+          <w:lang w:val="en-US"/>
+        </w:rPr>
+        <w:t>1)DFS:</w:t>
+      </w:r>
+    </w:p>
+    <w:p>
+      <w:pPr>
+        <w:rPr>
+          <w:b/>
+          <w:bCs/>
+          <w:lang w:val="en-US"/>
+        </w:rPr>
+      </w:pPr>
+      <w:r>
+        <w:rPr>
+          <w:b/>
+          <w:bCs/>
+          <w:lang w:val="en-US"/>
+        </w:rPr>
+        <w:t>-&gt;the depth first search can be divided into three types</w:t>
+      </w:r>
+    </w:p>
+    <w:p>
+      <w:pPr>
+        <w:rPr>
+          <w:b/>
+          <w:bCs/>
+          <w:lang w:val="en-US"/>
+        </w:rPr>
+      </w:pPr>
+      <w:r>
+        <w:rPr>
+          <w:b/>
+          <w:bCs/>
+          <w:lang w:val="en-US"/>
+        </w:rPr>
+        <w:tab/>
+      </w:r>
+      <w:proofErr w:type="spellStart"/>
+      <w:r>
+        <w:rPr>
+          <w:b/>
+          <w:bCs/>
+          <w:lang w:val="en-US"/>
+        </w:rPr>
+        <w:t>i</w:t>
+      </w:r>
+      <w:proofErr w:type="spellEnd"/>
+      <w:r>
+        <w:rPr>
+          <w:b/>
+          <w:bCs/>
+          <w:lang w:val="en-US"/>
+        </w:rPr>
+        <w:t>)preorder – 1 time visited print</w:t>
+      </w:r>
+    </w:p>
+    <w:p>
+      <w:pPr>
+        <w:rPr>
+          <w:b/>
+          <w:bCs/>
+          <w:lang w:val="en-US"/>
+        </w:rPr>
+      </w:pPr>
+      <w:r>
+        <w:rPr>
+          <w:b/>
+          <w:bCs/>
+          <w:lang w:val="en-US"/>
+        </w:rPr>
+        <w:tab/>
+        <w:t>ii)</w:t>
+      </w:r>
+      <w:proofErr w:type="spellStart"/>
+      <w:r>
+        <w:rPr>
+          <w:b/>
+          <w:bCs/>
+          <w:lang w:val="en-US"/>
+        </w:rPr>
+        <w:t>inorder</w:t>
+      </w:r>
+      <w:proofErr w:type="spellEnd"/>
+      <w:r>
+        <w:rPr>
+          <w:b/>
+          <w:bCs/>
+          <w:lang w:val="en-US"/>
+        </w:rPr>
+        <w:t xml:space="preserve"> – 2 time visited print</w:t>
+      </w:r>
+    </w:p>
+    <w:p>
+      <w:pPr>
+        <w:rPr>
+          <w:b/>
+          <w:bCs/>
+          <w:lang w:val="en-US"/>
+        </w:rPr>
+      </w:pPr>
+      <w:r>
+        <w:rPr>
+          <w:b/>
+          <w:bCs/>
+          <w:lang w:val="en-US"/>
+        </w:rPr>
+        <w:tab/>
+        <w:t>iii)</w:t>
+      </w:r>
+      <w:proofErr w:type="spellStart"/>
+      <w:r>
+        <w:rPr>
+          <w:b/>
+          <w:bCs/>
+          <w:lang w:val="en-US"/>
+        </w:rPr>
+        <w:t>postorder</w:t>
+      </w:r>
+      <w:proofErr w:type="spellEnd"/>
+      <w:r>
+        <w:rPr>
+          <w:b/>
+          <w:bCs/>
+          <w:lang w:val="en-US"/>
+        </w:rPr>
+        <w:t xml:space="preserve"> -3 time visited print</w:t>
+      </w:r>
+    </w:p>
+    <w:p>
+      <w:pPr>
+        <w:rPr>
+          <w:b/>
+          <w:bCs/>
+          <w:lang w:val="en-US"/>
+        </w:rPr>
+      </w:pPr>
+    </w:p>
+    <w:p>
+      <w:pPr>
+        <w:rPr>
+          <w:b/>
+          <w:bCs/>
+          <w:lang w:val="en-US"/>
+        </w:rPr>
+      </w:pPr>
+    </w:p>
+    <w:p>
+      <w:pPr>
+        <w:rPr>
+          <w:b/>
+          <w:bCs/>
+          <w:lang w:val="en-US"/>
+        </w:rPr>
+      </w:pPr>
+      <w:proofErr w:type="spellStart"/>
+      <w:r>
+        <w:rPr>
+          <w:b/>
+          <w:bCs/>
+          <w:lang w:val="en-US"/>
+        </w:rPr>
+        <w:t>i</w:t>
+      </w:r>
+      <w:proofErr w:type="spellEnd"/>
+      <w:r>
+        <w:rPr>
+          <w:b/>
+          <w:bCs/>
+          <w:lang w:val="en-US"/>
+        </w:rPr>
+        <w:t>)preorder</w:t>
+      </w:r>
+      <w:proofErr w:type="gramStart"/>
+      <w:r>
+        <w:rPr>
+          <w:b/>
+          <w:bCs/>
+          <w:lang w:val="en-US"/>
+        </w:rPr>
+        <w:t>:  (root ,</w:t>
+      </w:r>
+      <w:proofErr w:type="gramEnd"/>
+      <w:r>
+        <w:rPr>
+          <w:b/>
+          <w:bCs/>
+          <w:lang w:val="en-US"/>
+        </w:rPr>
+        <w:t xml:space="preserve"> </w:t>
+      </w:r>
+      <w:proofErr w:type="gramStart"/>
+      <w:r>
+        <w:rPr>
+          <w:b/>
+          <w:bCs/>
+          <w:lang w:val="en-US"/>
+        </w:rPr>
+        <w:t>left ,</w:t>
+      </w:r>
+      <w:proofErr w:type="gramEnd"/>
+      <w:r>
+        <w:rPr>
+          <w:b/>
+          <w:bCs/>
+          <w:lang w:val="en-US"/>
+        </w:rPr>
+        <w:t xml:space="preserve"> right)</w:t>
+      </w:r>
+    </w:p>
+    <w:p>
+      <w:pPr>
+        <w:rPr>
+          <w:b/>
+          <w:bCs/>
+          <w:lang w:val="en-US"/>
+        </w:rPr>
+      </w:pPr>
+      <w:r>
+        <w:rPr>
+          <w:b/>
+          <w:bCs/>
+          <w:lang w:val="en-US"/>
+        </w:rPr>
+        <w:t>-&gt;print whatever we see first</w:t>
+      </w:r>
+    </w:p>
+    <w:p>
+      <w:pPr>
+        <w:rPr>
+          <w:b/>
+          <w:bCs/>
+          <w:lang w:val="en-US"/>
+        </w:rPr>
+      </w:pPr>
+    </w:p>
+    <w:p>
+      <w:pPr>
+        <w:rPr>
+          <w:b/>
+          <w:bCs/>
+          <w:lang w:val="en-US"/>
+        </w:rPr>
+      </w:pPr>
+      <w:r>
+        <w:rPr>
+          <w:b/>
+          <w:bCs/>
+          <w:lang w:val="en-US"/>
+        </w:rPr>
+        <w:t>BASIC OUR LOGIC:</w:t>
+      </w:r>
+    </w:p>
+    <w:p>
+      <w:pPr>
+        <w:ind w:left="1440"/>
+        <w:rPr>
+          <w:b/>
+          <w:bCs/>
+          <w:lang w:val="en-US"/>
+        </w:rPr>
+      </w:pPr>
+      <w:proofErr w:type="gramStart"/>
+      <w:r>
+        <w:rPr>
+          <w:b/>
+          <w:bCs/>
+          <w:lang w:val="en-US"/>
+        </w:rPr>
+        <w:t>if(</w:t>
+      </w:r>
+      <w:proofErr w:type="spellStart"/>
+      <w:proofErr w:type="gramEnd"/>
+      <w:r>
+        <w:rPr>
+          <w:b/>
+          <w:bCs/>
+          <w:lang w:val="en-US"/>
+        </w:rPr>
+        <w:t>leftNode</w:t>
+      </w:r>
+      <w:proofErr w:type="spellEnd"/>
+      <w:r>
+        <w:rPr>
+          <w:b/>
+          <w:bCs/>
+          <w:lang w:val="en-US"/>
+        </w:rPr>
+        <w:t xml:space="preserve"> ==null &amp;&amp; </w:t>
+      </w:r>
+      <w:proofErr w:type="spellStart"/>
+      <w:r>
+        <w:rPr>
+          <w:b/>
+          <w:bCs/>
+          <w:lang w:val="en-US"/>
+        </w:rPr>
+        <w:t>rightNode</w:t>
+      </w:r>
+      <w:proofErr w:type="spellEnd"/>
+      <w:r>
+        <w:rPr>
+          <w:b/>
+          <w:bCs/>
+          <w:lang w:val="en-US"/>
+        </w:rPr>
+        <w:t xml:space="preserve"> ==null)</w:t>
+      </w:r>
+    </w:p>
+    <w:p>
+      <w:pPr>
+        <w:ind w:left="1440"/>
+        <w:rPr>
+          <w:b/>
+          <w:bCs/>
+          <w:lang w:val="en-US"/>
+        </w:rPr>
+      </w:pPr>
+      <w:r>
+        <w:rPr>
+          <w:b/>
+          <w:bCs/>
+          <w:lang w:val="en-US"/>
+        </w:rPr>
+        <w:t xml:space="preserve">    return true;</w:t>
+      </w:r>
+    </w:p>
+    <w:p>
+      <w:pPr>
+        <w:ind w:left="1440"/>
+        <w:rPr>
+          <w:b/>
+          <w:bCs/>
+          <w:lang w:val="en-US"/>
+        </w:rPr>
+      </w:pPr>
+    </w:p>
+    <w:p>
+      <w:pPr>
+        <w:ind w:left="1440"/>
+        <w:rPr>
+          <w:b/>
+          <w:bCs/>
+          <w:lang w:val="en-US"/>
+        </w:rPr>
+      </w:pPr>
+      <w:r>
+        <w:rPr>
+          <w:b/>
+          <w:bCs/>
+          <w:lang w:val="en-US"/>
+        </w:rPr>
+        <w:t>else if ((</w:t>
+      </w:r>
+      <w:proofErr w:type="spellStart"/>
+      <w:r>
+        <w:rPr>
+          <w:b/>
+          <w:bCs/>
+          <w:lang w:val="en-US"/>
+        </w:rPr>
+        <w:t>leftNode</w:t>
+      </w:r>
+      <w:proofErr w:type="spellEnd"/>
+      <w:r>
+        <w:rPr>
+          <w:b/>
+          <w:bCs/>
+          <w:lang w:val="en-US"/>
+        </w:rPr>
+        <w:t xml:space="preserve">==null &amp;&amp; </w:t>
+      </w:r>
+      <w:proofErr w:type="spellStart"/>
+      <w:proofErr w:type="gramStart"/>
+      <w:r>
+        <w:rPr>
+          <w:b/>
+          <w:bCs/>
+          <w:lang w:val="en-US"/>
+        </w:rPr>
+        <w:t>rightNode</w:t>
+      </w:r>
+      <w:proofErr w:type="spellEnd"/>
+      <w:r>
+        <w:rPr>
+          <w:b/>
+          <w:bCs/>
+          <w:lang w:val="en-US"/>
+        </w:rPr>
+        <w:t>!=null)|</w:t>
+      </w:r>
+      <w:proofErr w:type="gramEnd"/>
+      <w:r>
+        <w:rPr>
+          <w:b/>
+          <w:bCs/>
+          <w:lang w:val="en-US"/>
+        </w:rPr>
+        <w:t>|</w:t>
+      </w:r>
+    </w:p>
+    <w:p>
+      <w:pPr>
+        <w:ind w:left="1440"/>
+        <w:rPr>
+          <w:b/>
+          <w:bCs/>
+          <w:lang w:val="en-US"/>
+        </w:rPr>
+      </w:pPr>
+      <w:r>
+        <w:rPr>
+          <w:b/>
+          <w:bCs/>
+          <w:lang w:val="en-US"/>
+        </w:rPr>
+        <w:t>(</w:t>
+      </w:r>
+      <w:proofErr w:type="spellStart"/>
+      <w:proofErr w:type="gramStart"/>
+      <w:r>
+        <w:rPr>
+          <w:b/>
+          <w:bCs/>
+          <w:lang w:val="en-US"/>
+        </w:rPr>
+        <w:t>leftNode</w:t>
+      </w:r>
+      <w:proofErr w:type="spellEnd"/>
+      <w:r>
+        <w:rPr>
+          <w:b/>
+          <w:bCs/>
+          <w:lang w:val="en-US"/>
+        </w:rPr>
+        <w:t>!=</w:t>
+      </w:r>
+      <w:proofErr w:type="gramEnd"/>
+      <w:r>
+        <w:rPr>
+          <w:b/>
+          <w:bCs/>
+          <w:lang w:val="en-US"/>
+        </w:rPr>
+        <w:t xml:space="preserve">null &amp;&amp; </w:t>
+      </w:r>
+      <w:proofErr w:type="spellStart"/>
+      <w:r>
+        <w:rPr>
+          <w:b/>
+          <w:bCs/>
+          <w:lang w:val="en-US"/>
+        </w:rPr>
+        <w:t>rightNode</w:t>
+      </w:r>
+      <w:proofErr w:type="spellEnd"/>
+      <w:r>
+        <w:rPr>
+          <w:b/>
+          <w:bCs/>
+          <w:lang w:val="en-US"/>
+        </w:rPr>
+        <w:t>==null))</w:t>
+      </w:r>
+    </w:p>
+    <w:p>
+      <w:pPr>
+        <w:ind w:left="1440"/>
+        <w:rPr>
+          <w:b/>
+          <w:bCs/>
+          <w:lang w:val="en-US"/>
+        </w:rPr>
+      </w:pPr>
+      <w:r>
+        <w:rPr>
+          <w:b/>
+          <w:bCs/>
+          <w:lang w:val="en-US"/>
+        </w:rPr>
+        <w:t xml:space="preserve">    return false;</w:t>
+      </w:r>
+    </w:p>
+    <w:p>
+      <w:pPr>
+        <w:rPr>
+          <w:b/>
+          <w:bCs/>
+          <w:lang w:val="en-US"/>
+        </w:rPr>
+      </w:pPr>
+    </w:p>
+    <w:p>
+      <w:pPr>
+        <w:rPr>
+          <w:b/>
+          <w:bCs/>
+          <w:lang w:val="en-US"/>
+        </w:rPr>
+      </w:pPr>
+      <w:r>
+        <w:rPr>
+          <w:b/>
+          <w:bCs/>
+          <w:lang w:val="en-US"/>
+        </w:rPr>
+        <w:t xml:space="preserve">BETTER </w:t>
+      </w:r>
+      <w:proofErr w:type="gramStart"/>
+      <w:r>
+        <w:rPr>
+          <w:b/>
+          <w:bCs/>
+          <w:lang w:val="en-US"/>
+        </w:rPr>
+        <w:t>ONE :</w:t>
+      </w:r>
+      <w:proofErr w:type="gramEnd"/>
+    </w:p>
+    <w:p>
+      <w:pPr>
+        <w:rPr>
+          <w:b/>
+          <w:bCs/>
+          <w:lang w:val="en-US"/>
+        </w:rPr>
+      </w:pPr>
+      <w:r>
+        <w:rPr>
+          <w:b/>
+          <w:bCs/>
+          <w:lang w:val="en-US"/>
+        </w:rPr>
+        <w:tab/>
+      </w:r>
+      <w:proofErr w:type="gramStart"/>
+      <w:r>
+        <w:rPr>
+          <w:b/>
+          <w:bCs/>
+          <w:lang w:val="en-US"/>
+        </w:rPr>
+        <w:t>if(</w:t>
+      </w:r>
+      <w:proofErr w:type="spellStart"/>
+      <w:proofErr w:type="gramEnd"/>
+      <w:r>
+        <w:rPr>
+          <w:b/>
+          <w:bCs/>
+          <w:lang w:val="en-US"/>
+        </w:rPr>
+        <w:t>leftNode</w:t>
+      </w:r>
+      <w:proofErr w:type="spellEnd"/>
+      <w:r>
+        <w:rPr>
+          <w:b/>
+          <w:bCs/>
+          <w:lang w:val="en-US"/>
+        </w:rPr>
+        <w:t xml:space="preserve"> == null || </w:t>
+      </w:r>
+      <w:proofErr w:type="spellStart"/>
+      <w:r>
+        <w:rPr>
+          <w:b/>
+          <w:bCs/>
+          <w:lang w:val="en-US"/>
+        </w:rPr>
+        <w:t>rightNode</w:t>
+      </w:r>
+      <w:proofErr w:type="spellEnd"/>
+      <w:r>
+        <w:rPr>
+          <w:b/>
+          <w:bCs/>
+          <w:lang w:val="en-US"/>
+        </w:rPr>
+        <w:t xml:space="preserve"> == null)</w:t>
+      </w:r>
+    </w:p>
+    <w:p>
+      <w:pPr>
+        <w:rPr>
+          <w:b/>
+          <w:bCs/>
+          <w:lang w:val="en-US"/>
+        </w:rPr>
+      </w:pPr>
+      <w:r>
+        <w:rPr>
+          <w:b/>
+          <w:bCs/>
+          <w:lang w:val="en-US"/>
+        </w:rPr>
+        <w:t xml:space="preserve">   </w:t>
+      </w:r>
+      <w:r>
+        <w:rPr>
+          <w:b/>
+          <w:bCs/>
+          <w:lang w:val="en-US"/>
+        </w:rPr>
+        <w:tab/>
+      </w:r>
+      <w:r>
+        <w:rPr>
+          <w:b/>
+          <w:bCs/>
+          <w:lang w:val="en-US"/>
+        </w:rPr>
+        <w:tab/>
+      </w:r>
+      <w:r>
+        <w:rPr>
+          <w:b/>
+          <w:bCs/>
+          <w:lang w:val="en-US"/>
+        </w:rPr>
+        <w:t xml:space="preserve"> return </w:t>
+      </w:r>
+      <w:proofErr w:type="spellStart"/>
+      <w:r>
+        <w:rPr>
+          <w:b/>
+          <w:bCs/>
+          <w:lang w:val="en-US"/>
+        </w:rPr>
+        <w:t>leftNode</w:t>
+      </w:r>
+      <w:proofErr w:type="spellEnd"/>
+      <w:r>
+        <w:rPr>
+          <w:b/>
+          <w:bCs/>
+          <w:lang w:val="en-US"/>
+        </w:rPr>
+        <w:t xml:space="preserve"> == </w:t>
+      </w:r>
+      <w:proofErr w:type="spellStart"/>
+      <w:r>
+        <w:rPr>
+          <w:b/>
+          <w:bCs/>
+          <w:lang w:val="en-US"/>
+        </w:rPr>
+        <w:t>rightNode</w:t>
+      </w:r>
+      <w:proofErr w:type="spellEnd"/>
+      <w:r>
+        <w:rPr>
+          <w:b/>
+          <w:bCs/>
+          <w:lang w:val="en-US"/>
+        </w:rPr>
+        <w:t>;</w:t>
+      </w:r>
+    </w:p>
+    <w:p>
+      <w:pPr>
+        <w:rPr>
+          <w:b/>
+          <w:bCs/>
+          <w:lang w:val="en-US"/>
+        </w:rPr>
+      </w:pPr>
+    </w:p>
+    <w:p>
+      <w:pPr>
+        <w:rPr>
+          <w:b/>
+          <w:bCs/>
+          <w:lang w:val="en-US"/>
+        </w:rPr>
+      </w:pPr>
+    </w:p>
+    <w:p>
+      <w:pPr>
+        <w:rPr>
+          <w:b/>
+          <w:bCs/>
+          <w:lang w:val="en-US"/>
+        </w:rPr>
+      </w:pPr>
+    </w:p>
+    <w:p>
+      <w:pPr>
+        <w:rPr>
+          <w:b/>
+          <w:bCs/>
+          <w:lang w:val="en-US"/>
+        </w:rPr>
+      </w:pPr>
+    </w:p>
+    <w:p>
+      <w:pPr>
+        <w:rPr>
+          <w:b/>
+          <w:bCs/>
+          <w:lang w:val="en-US"/>
+        </w:rPr>
+      </w:pPr>
+    </w:p>
+    <w:p>
+      <w:pPr>
+        <w:rPr>
+          <w:b/>
+          <w:bCs/>
+          <w:lang w:val="en-US"/>
+        </w:rPr>
+      </w:pPr>
+    </w:p>
+    <w:p>
+      <w:pPr>
+        <w:rPr>
+          <w:b/>
+          <w:bCs/>
+          <w:lang w:val="en-US"/>
+        </w:rPr>
+      </w:pPr>
+    </w:p>
+    <w:p>
+      <w:pPr>
+        <w:rPr>
+          <w:b/>
+          <w:bCs/>
+          <w:lang w:val="en-US"/>
+        </w:rPr>
+      </w:pPr>
+    </w:p>
+    <w:p>
+      <w:pPr>
+        <w:rPr>
+          <w:b/>
+          <w:bCs/>
+          <w:lang w:val="en-US"/>
+        </w:rPr>
+      </w:pPr>
+    </w:p>
+    <w:p>
+      <w:pPr>
+        <w:rPr>
+          <w:b/>
+          <w:bCs/>
+          <w:lang w:val="en-US"/>
+        </w:rPr>
+      </w:pPr>
+    </w:p>
+    <w:p>
+      <w:pPr>
+        <w:rPr>
+          <w:b/>
+          <w:bCs/>
+          <w:lang w:val="en-US"/>
+        </w:rPr>
+      </w:pPr>
+    </w:p>
+    <w:p>
+      <w:pPr>
+        <w:rPr>
+          <w:b/>
+          <w:bCs/>
+          <w:lang w:val="en-US"/>
+        </w:rPr>
+      </w:pPr>
+    </w:p>
+    <w:p>
+      <w:pPr>
+        <w:rPr>
+          <w:b/>
+          <w:bCs/>
+          <w:lang w:val="en-US"/>
+        </w:rPr>
+      </w:pPr>
+    </w:p>
+    <w:p>
+      <w:pPr>
+        <w:rPr>
+          <w:b/>
+          <w:bCs/>
+          <w:lang w:val="en-US"/>
+        </w:rPr>
+      </w:pPr>
+    </w:p>
+    <w:p>
+      <w:pPr>
+        <w:rPr>
+          <w:b/>
+          <w:bCs/>
+          <w:lang w:val="en-US"/>
+        </w:rPr>
+      </w:pPr>
+    </w:p>
+    <w:p>
+      <w:pPr>
+        <w:rPr>
+          <w:b/>
+          <w:bCs/>
+          <w:lang w:val="en-US"/>
+        </w:rPr>
+      </w:pPr>
+    </w:p>
+    <w:p>
+      <w:pPr>
+        <w:rPr>
+          <w:b/>
+          <w:bCs/>
+          <w:lang w:val="en-US"/>
+        </w:rPr>
+      </w:pPr>
+    </w:p>
+    <w:p>
+      <w:pPr>
+        <w:rPr>
+          <w:b/>
+          <w:bCs/>
+          <w:lang w:val="en-US"/>
+        </w:rPr>
+      </w:pPr>
+    </w:p>
+    <w:p>
+      <w:pPr>
+        <w:rPr>
+          <w:b/>
+          <w:bCs/>
+          <w:lang w:val="en-US"/>
+        </w:rPr>
+      </w:pPr>
+    </w:p>
+    <w:p>
+      <w:pPr>
+        <w:rPr>
+          <w:b/>
+          <w:bCs/>
+          <w:lang w:val="en-US"/>
+        </w:rPr>
+      </w:pPr>
+    </w:p>
+    <w:p>
+      <w:pPr>
+        <w:rPr>
+          <w:b/>
+          <w:bCs/>
+          <w:lang w:val="en-US"/>
+        </w:rPr>
+      </w:pPr>
+    </w:p>
+    <w:p>
+      <w:pPr>
+        <w:rPr>
+          <w:b/>
+          <w:bCs/>
+          <w:lang w:val="en-US"/>
+        </w:rPr>
+      </w:pPr>
+    </w:p>
+    <w:p>
+      <w:pPr>
+        <w:rPr>
+          <w:b/>
+          <w:bCs/>
+          <w:lang w:val="en-US"/>
+        </w:rPr>
+      </w:pPr>
+      <w:r>
+        <w:rPr>
+          <w:b/>
+          <w:bCs/>
+          <w:lang w:val="en-US"/>
+        </w:rPr>
+        <w:t xml:space="preserve">BREADTH FIRST </w:t>
+      </w:r>
+      <w:proofErr w:type="gramStart"/>
+      <w:r>
+        <w:rPr>
+          <w:b/>
+          <w:bCs/>
+          <w:lang w:val="en-US"/>
+        </w:rPr>
+        <w:t>SEARCH :</w:t>
+      </w:r>
+      <w:proofErr w:type="gramEnd"/>
+    </w:p>
+    <w:p>
+      <w:r>
+        <w:t xml:space="preserve">public List&lt;List&lt;Integer&gt;&gt; </w:t>
+      </w:r>
+      <w:proofErr w:type="spellStart"/>
+      <w:r>
+        <w:t>levelOrder</w:t>
+      </w:r>
+      <w:proofErr w:type="spellEnd"/>
+      <w:r>
+        <w:t>(</w:t>
+      </w:r>
+      <w:proofErr w:type="spellStart"/>
+      <w:r>
+        <w:t>TreeNode</w:t>
+      </w:r>
+      <w:proofErr w:type="spellEnd"/>
+      <w:r>
+        <w:t xml:space="preserve"> root) {</w:t>
+      </w:r>
+    </w:p>
+    <w:p>
+      <w:r>
+        <w:t xml:space="preserve">        List&lt;List&lt;Integer&gt;&gt; res = new </w:t>
+      </w:r>
+      <w:proofErr w:type="spellStart"/>
+      <w:r>
+        <w:t>ArrayList</w:t>
+      </w:r>
+      <w:proofErr w:type="spellEnd"/>
+      <w:r>
+        <w:t>();</w:t>
+      </w:r>
+    </w:p>
+    <w:p>
+      <w:r>
+        <w:t>        if(root==null)</w:t>
+      </w:r>
+    </w:p>
+    <w:p>
+      <w:r>
+        <w:t>            return res;</w:t>
+      </w:r>
+    </w:p>
+    <w:p>
+      <w:r>
+        <w:t xml:space="preserve">        </w:t>
+      </w:r>
+      <w:proofErr w:type="spellStart"/>
+      <w:r>
+        <w:t>ArrayDeque</w:t>
+      </w:r>
+      <w:proofErr w:type="spellEnd"/>
+      <w:r>
+        <w:t>&lt;</w:t>
+      </w:r>
+      <w:proofErr w:type="spellStart"/>
+      <w:r>
+        <w:t>TreeNode</w:t>
+      </w:r>
+      <w:proofErr w:type="spellEnd"/>
+      <w:r>
+        <w:t xml:space="preserve">&gt; </w:t>
+      </w:r>
+      <w:proofErr w:type="spellStart"/>
+      <w:r>
+        <w:t>dq</w:t>
+      </w:r>
+      <w:proofErr w:type="spellEnd"/>
+      <w:r>
+        <w:t xml:space="preserve"> = new </w:t>
+      </w:r>
+      <w:proofErr w:type="spellStart"/>
+      <w:r>
+        <w:t>ArrayDeque</w:t>
+      </w:r>
+      <w:proofErr w:type="spellEnd"/>
+      <w:r>
+        <w:t>();</w:t>
+      </w:r>
+    </w:p>
+    <w:p>
+      <w:r>
+        <w:t xml:space="preserve">        </w:t>
+      </w:r>
+      <w:proofErr w:type="spellStart"/>
+      <w:r>
+        <w:t>dq.offer</w:t>
+      </w:r>
+      <w:proofErr w:type="spellEnd"/>
+      <w:r>
+        <w:t>(root);//first push the root node to access</w:t>
+      </w:r>
+    </w:p>
+    <w:p>
+      <w:r>
+        <w:t>        while(!</w:t>
+      </w:r>
+      <w:proofErr w:type="spellStart"/>
+      <w:r>
+        <w:t>dq.isEmpty</w:t>
+      </w:r>
+      <w:proofErr w:type="spellEnd"/>
+      <w:r>
+        <w:t>())</w:t>
+      </w:r>
+    </w:p>
+    <w:p>
+      <w:r>
+        <w:t>        {</w:t>
+      </w:r>
+    </w:p>
+    <w:p>
+      <w:pPr>
+        <w:rPr>
+          <w:b/>
+          <w:bCs/>
+        </w:rPr>
+      </w:pPr>
+      <w:r>
         <w:lastRenderedPageBreak/>
-        <w:t xml:space="preserve">BREADTH FIRST </w:t>
-      </w:r>
-      <w:proofErr w:type="gramStart"/>
-      <w:r>
-        <w:rPr>
-          <w:b/>
-          <w:bCs/>
-          <w:lang w:val="en-US"/>
-        </w:rPr>
-        <w:t>SEARCH :</w:t>
-      </w:r>
-      <w:proofErr w:type="gramEnd"/>
-    </w:p>
-    <w:p>
-      <w:r>
-        <w:t xml:space="preserve">public List&lt;List&lt;Integer&gt;&gt; </w:t>
-      </w:r>
-      <w:proofErr w:type="spellStart"/>
-      <w:r>
-        <w:t>levelOrder</w:t>
-      </w:r>
-      <w:proofErr w:type="spellEnd"/>
-      <w:r>
-        <w:t>(</w:t>
-      </w:r>
-      <w:proofErr w:type="spellStart"/>
-      <w:r>
-        <w:t>TreeNode</w:t>
-      </w:r>
-      <w:proofErr w:type="spellEnd"/>
-      <w:r>
-        <w:t xml:space="preserve"> root) {</w:t>
-      </w:r>
-    </w:p>
-    <w:p>
-      <w:r>
-        <w:t xml:space="preserve">        List&lt;List&lt;Integer&gt;&gt; res = new </w:t>
-      </w:r>
-      <w:proofErr w:type="spellStart"/>
-      <w:r>
-        <w:t>ArrayList</w:t>
-      </w:r>
-      <w:proofErr w:type="spellEnd"/>
-      <w:r>
-        <w:t>();</w:t>
-      </w:r>
-    </w:p>
-    <w:p>
-      <w:r>
-        <w:t>        if(root==null)</w:t>
-      </w:r>
-    </w:p>
-    <w:p>
-      <w:r>
-        <w:t>            return res;</w:t>
-      </w:r>
-    </w:p>
-    <w:p>
-      <w:r>
-        <w:t xml:space="preserve">        </w:t>
-      </w:r>
-      <w:proofErr w:type="spellStart"/>
-      <w:r>
-        <w:t>ArrayDeque</w:t>
-      </w:r>
-      <w:proofErr w:type="spellEnd"/>
-      <w:r>
-        <w:t>&lt;</w:t>
-      </w:r>
-      <w:proofErr w:type="spellStart"/>
-      <w:r>
-        <w:t>TreeNode</w:t>
-      </w:r>
-      <w:proofErr w:type="spellEnd"/>
-      <w:r>
-        <w:t xml:space="preserve">&gt; </w:t>
-      </w:r>
-      <w:proofErr w:type="spellStart"/>
-      <w:r>
-        <w:t>dq</w:t>
-      </w:r>
-      <w:proofErr w:type="spellEnd"/>
-      <w:r>
-        <w:t xml:space="preserve"> = new </w:t>
-      </w:r>
-      <w:proofErr w:type="spellStart"/>
-      <w:r>
-        <w:t>ArrayDeque</w:t>
-      </w:r>
-      <w:proofErr w:type="spellEnd"/>
-      <w:r>
-        <w:t>();</w:t>
-      </w:r>
-    </w:p>
-    <w:p>
-      <w:r>
-        <w:t xml:space="preserve">        </w:t>
-      </w:r>
-      <w:proofErr w:type="spellStart"/>
-      <w:r>
-        <w:t>dq.offer</w:t>
-      </w:r>
-      <w:proofErr w:type="spellEnd"/>
-      <w:r>
-        <w:t>(root);//first push the root node to access</w:t>
-      </w:r>
-    </w:p>
-    <w:p>
-      <w:r>
-        <w:t>        while(!</w:t>
-      </w:r>
-      <w:proofErr w:type="spellStart"/>
-      <w:r>
-        <w:t>dq.isEmpty</w:t>
-      </w:r>
-      <w:proofErr w:type="spellEnd"/>
-      <w:r>
-        <w:t>())</w:t>
-      </w:r>
-    </w:p>
-    <w:p>
-      <w:r>
-        <w:t>        {</w:t>
-      </w:r>
-    </w:p>
-    <w:p>
-      <w:pPr>
-        <w:rPr>
-          <w:b/>
-          <w:bCs/>
-        </w:rPr>
-      </w:pPr>
-      <w:r>
         <w:t xml:space="preserve">            int size = </w:t>
       </w:r>
       <w:proofErr w:type="spellStart"/>

</xml_diff>